<commit_message>
Micro Lecture 7: cross-examine the recording box against both transcripts
Every quote and aside in MICROL7AUDIO now checked against the local
faster-whisper transcripts as well as Notability's; all appear in both.
Exact timestamps replace "about minute N", "[you]" and "[it]" edits become
verbatim, the single-source caveat is removed, the B/T cell pairing records
her repeat at 34:12, the do-not-memorize count is corrected to six slides,
and the two "distrust" items are reclassed as spoken slips heard in both.

Co-Authored-By: Claude Opus 5.5 (1M context) <noreply@anthropic.com>
</commit_message>
<xml_diff>
--- a/Microbiology Exam 2/micro-exam-2-study-guide.docx
+++ b/Microbiology Exam 2/micro-exam-2-study-guide.docx
@@ -376,14 +376,28 @@
                 <w:b/>
                 <w:i w:val="0"/>
               </w:rPr>
-              <w:t>Read from one transcript so far</w:t>
+              <w:t>Both transcripts read and compared</w:t>
             </w:r>
             <w:r>
               <w:rPr>
                 <w:b w:val="0"/>
                 <w:i w:val="0"/>
               </w:rPr>
-              <w:t xml:space="preserve"> (Notability’s own); the second, independent transcription was still running when this guide was built, so the quotes below have not yet been cross-checked against it. Every factual claim was checked against the deck, and where the two differ the slide is what this guide teaches.</w:t>
+              <w:t xml:space="preserve"> (Notability’s own and an independent local transcription); </w:t>
+            </w:r>
+            <w:r>
+              <w:rPr>
+                <w:b/>
+                <w:i w:val="0"/>
+              </w:rPr>
+              <w:t>every quote below appears in both</w:t>
+            </w:r>
+            <w:r>
+              <w:rPr>
+                <w:b w:val="0"/>
+                <w:i w:val="0"/>
+              </w:rPr>
+              <w:t>, with the same wording and timing. Every factual claim was checked against the deck, and where the two differ the slide is what this guide teaches.</w:t>
             </w:r>
           </w:p>
           <w:p>
@@ -402,14 +416,14 @@
                 <w:b w:val="0"/>
                 <w:i w:val="0"/>
               </w:rPr>
-              <w:t xml:space="preserve"> It names one chart to learn, one mechanism that matters most, and </w:t>
+              <w:t xml:space="preserve"> It names one chart to learn, one mechanism that matters most, one pairing she said outright you need to know, and </w:t>
             </w:r>
             <w:r>
               <w:rPr>
                 <w:b/>
                 <w:i w:val="0"/>
               </w:rPr>
-              <w:t>five slides not to memorize</w:t>
+              <w:t>six slides not to memorize</w:t>
             </w:r>
             <w:r>
               <w:rPr>
@@ -539,7 +553,7 @@
                       <w:i w:val="0"/>
                       <w:sz w:val="18"/>
                     </w:rPr>
-                    <w:t xml:space="preserve"> [part 1, about minute 10]</w:t>
+                    <w:t xml:space="preserve"> [part 1, 10:14]</w:t>
                   </w:r>
                 </w:p>
               </w:tc>
@@ -587,7 +601,7 @@
                       <w:i/>
                       <w:sz w:val="18"/>
                     </w:rPr>
-                    <w:t xml:space="preserve">“The most important thing I want [you] to remember about this is </w:t>
+                    <w:t xml:space="preserve">“The most important thing I want you to remember about this is </w:t>
                   </w:r>
                   <w:r>
                     <w:rPr>
@@ -612,7 +626,7 @@
                       <w:i w:val="0"/>
                       <w:sz w:val="18"/>
                     </w:rPr>
-                    <w:t xml:space="preserve"> [part 1, about minute 34]</w:t>
+                    <w:t xml:space="preserve"> [part 1, 34:23]</w:t>
                   </w:r>
                 </w:p>
               </w:tc>
@@ -685,7 +699,7 @@
                       <w:i w:val="0"/>
                       <w:sz w:val="18"/>
                     </w:rPr>
-                    <w:t xml:space="preserve"> [part 2, about minute 13] — and of autoimmunity, </w:t>
+                    <w:t xml:space="preserve"> [part 2, 13:13] — and of autoimmunity, </w:t>
                   </w:r>
                   <w:r>
                     <w:rPr>
@@ -693,7 +707,7 @@
                       <w:i/>
                       <w:sz w:val="18"/>
                     </w:rPr>
-                    <w:t>“type 1 is not involved in either of these.”</w:t>
+                    <w:t>“type one is not involved in either of these.”</w:t>
                   </w:r>
                   <w:r>
                     <w:rPr>
@@ -701,7 +715,7 @@
                       <w:i w:val="0"/>
                       <w:sz w:val="18"/>
                     </w:rPr>
-                    <w:t xml:space="preserve"> [part 2, about minute 21]</w:t>
+                    <w:t xml:space="preserve"> [part 2, 21:50]</w:t>
                   </w:r>
                 </w:p>
               </w:tc>
@@ -749,7 +763,7 @@
                       <w:i/>
                       <w:sz w:val="18"/>
                     </w:rPr>
-                    <w:t xml:space="preserve">“B cell defect is agammaglobulinemia… we associate [it] with more bacterial infections. And </w:t>
+                    <w:t xml:space="preserve">“B cell defect is agammaglobulinemia… this we associate with more bacterial infections. And </w:t>
                   </w:r>
                   <w:r>
                     <w:rPr>
@@ -774,7 +788,23 @@
                       <w:i w:val="0"/>
                       <w:sz w:val="18"/>
                     </w:rPr>
-                    <w:t xml:space="preserve"> [part 2, about minute 32]</w:t>
+                    <w:t xml:space="preserve"> [part 2, 32:34] She repeated the pairing a minute and a half later: </w:t>
+                  </w:r>
+                  <w:r>
+                    <w:rPr>
+                      <w:b w:val="0"/>
+                      <w:i/>
+                      <w:sz w:val="18"/>
+                    </w:rPr>
+                    <w:t>“remember the T cell deficiency, you get more of fungal, viral, protozoan infections; B cell deficiency, more of the bacterial infections.”</w:t>
+                  </w:r>
+                  <w:r>
+                    <w:rPr>
+                      <w:b w:val="0"/>
+                      <w:i w:val="0"/>
+                      <w:sz w:val="18"/>
+                    </w:rPr>
+                    <w:t xml:space="preserve"> [part 2, 34:12]</w:t>
                   </w:r>
                 </w:p>
               </w:tc>
@@ -813,7 +843,7 @@
                       <w:i w:val="0"/>
                       <w:sz w:val="18"/>
                     </w:rPr>
-                    <w:t xml:space="preserve"> infections; T cell deficiency → fungal, viral and protozoan (slide 63–64).</w:t>
+                    <w:t xml:space="preserve"> infections; T cell deficiency → fungal, viral and protozoan (slides 63–64). The only thing in the lecture said twice and called “need to know”.</w:t>
                   </w:r>
                 </w:p>
               </w:tc>
@@ -846,7 +876,7 @@
                       <w:i w:val="0"/>
                       <w:sz w:val="18"/>
                     </w:rPr>
-                    <w:t xml:space="preserve"> [part 1, about minute 4]</w:t>
+                    <w:t xml:space="preserve"> [part 1, 4:07]</w:t>
                   </w:r>
                 </w:p>
               </w:tc>
@@ -902,7 +932,7 @@
                       <w:i w:val="0"/>
                       <w:sz w:val="18"/>
                     </w:rPr>
-                    <w:t xml:space="preserve"> [part 2, about minute 19]</w:t>
+                    <w:t xml:space="preserve"> [part 2, 19:57]</w:t>
                   </w:r>
                 </w:p>
               </w:tc>
@@ -958,7 +988,7 @@
                       <w:i w:val="0"/>
                       <w:sz w:val="18"/>
                     </w:rPr>
-                    <w:t xml:space="preserve"> [part 2, about minutes 29–30]</w:t>
+                    <w:t xml:space="preserve"> [part 2, 29:48–30:11]</w:t>
                   </w:r>
                 </w:p>
               </w:tc>
@@ -1014,7 +1044,7 @@
                       <w:i w:val="0"/>
                       <w:sz w:val="18"/>
                     </w:rPr>
-                    <w:t xml:space="preserve"> [part 2, about minute 37]</w:t>
+                    <w:t xml:space="preserve"> [part 2, 37:03]</w:t>
                   </w:r>
                 </w:p>
               </w:tc>
@@ -1094,7 +1124,7 @@
                       <w:i w:val="0"/>
                       <w:sz w:val="18"/>
                     </w:rPr>
-                    <w:t xml:space="preserve"> [part 2, about minutes 38–39]</w:t>
+                    <w:t xml:space="preserve"> [part 2, 39:27–39:45]</w:t>
                   </w:r>
                 </w:p>
               </w:tc>
@@ -1145,7 +1175,7 @@
                 <w:b w:val="0"/>
                 <w:i w:val="0"/>
               </w:rPr>
-              <w:t xml:space="preserve"> — consistent with the deck, useful as hooks:</w:t>
+              <w:t xml:space="preserve"> — consistent with the deck, useful as hooks, and each present in both transcripts:</w:t>
             </w:r>
           </w:p>
           <w:p>
@@ -1183,7 +1213,7 @@
                 <w:i w:val="0"/>
                 <w:sz w:val="20"/>
               </w:rPr>
-              <w:t xml:space="preserve"> Rh-positive baby is the one at risk.</w:t>
+              <w:t xml:space="preserve"> Rh-positive baby is the one at risk. [part 1, 43:22]</w:t>
             </w:r>
           </w:p>
           <w:p>
@@ -1213,7 +1243,7 @@
                 <w:i w:val="0"/>
                 <w:sz w:val="20"/>
               </w:rPr>
-              <w:t>, and once positive it stays positive because of memory cells.</w:t>
+              <w:t>, and once positive it stays positive because of memory cells. [part 2, 4:19]</w:t>
             </w:r>
           </w:p>
           <w:p>
@@ -1259,7 +1289,7 @@
                 <w:i w:val="0"/>
                 <w:sz w:val="20"/>
               </w:rPr>
-              <w:t xml:space="preserve"> to make effector T cells — by which time the exposed skin has shed, so the first contact produces no rash.</w:t>
+              <w:t xml:space="preserve"> to make effector T cells — by which time the exposed skin has shed, so the first contact produces no rash. [part 2, 5:32–6:22]</w:t>
             </w:r>
           </w:p>
           <w:p>
@@ -1305,7 +1335,7 @@
                 <w:i w:val="0"/>
                 <w:sz w:val="20"/>
               </w:rPr>
-              <w:t xml:space="preserve"> is the universal recipient (no anti-A or anti-B antibody in the serum).</w:t>
+              <w:t xml:space="preserve"> is the universal recipient (no anti-A or anti-B antibody in the serum). [part 1, 38:19–39:20]</w:t>
             </w:r>
           </w:p>
           <w:p>
@@ -1335,7 +1365,7 @@
                 <w:i w:val="0"/>
                 <w:sz w:val="20"/>
               </w:rPr>
-              <w:t xml:space="preserve"> human leukocyte antigen markers, and even that is not always enough to prevent graft versus host disease.</w:t>
+              <w:t xml:space="preserve"> human leukocyte antigen markers, and even that is not always enough to prevent graft versus host disease. [part 2, 18:43]</w:t>
             </w:r>
           </w:p>
           <w:p>
@@ -1349,7 +1379,7 @@
                 <w:i w:val="0"/>
                 <w:sz w:val="20"/>
               </w:rPr>
-              <w:t>“Nobody actually dies of HIV [human immunodeficiency virus]. They die of the things you catch because of the suppressed immune system.”</w:t>
+              <w:t>“Nobody actually dies of HIV [human immunodeficiency virus]. They die of the things you catch because of the suppressed immune system.” [part 2, 35:30]</w:t>
             </w:r>
           </w:p>
           <w:p>
@@ -1361,14 +1391,28 @@
                 <w:b/>
                 <w:i w:val="0"/>
               </w:rPr>
-              <w:t>Two things to distrust in the transcript:</w:t>
+              <w:t>Two slips to ignore</w:t>
             </w:r>
             <w:r>
               <w:rPr>
                 <w:b w:val="0"/>
                 <w:i w:val="0"/>
               </w:rPr>
-              <w:t xml:space="preserve"> it has the lecturer describe immune complexes as “a type 2 reaction” at the start of part 2 (slide 38 says type III, and it is type III) and allergy as “IgA [immunoglobulin A] mediated” (slide 23 says immunoglobulin E). Both may be transcription errors; the second transcription will settle it. Go by the slides.</w:t>
+              <w:t xml:space="preserve">, both now heard in </w:t>
+            </w:r>
+            <w:r>
+              <w:rPr>
+                <w:b w:val="0"/>
+                <w:i/>
+              </w:rPr>
+              <w:t>both</w:t>
+            </w:r>
+            <w:r>
+              <w:rPr>
+                <w:b w:val="0"/>
+                <w:i w:val="0"/>
+              </w:rPr>
+              <w:t xml:space="preserve"> transcripts, so they are what was said rather than transcription errors. She opens part 2 by calling immune complexes “a type 2 reaction” [part 2, 0:07], straight after closing part 1 with “before we start with type three”; slide 38 says type III, and it is type III. And she calls allergy “IgA mediated” [part 1, 25:47] in the late-phase sentence, then says “those new IgE” eight seconds later; slide 23 says immunoglobulin E. (IgE and IgA sound alike, so a shared mishearing cannot be ruled out; either way the answer is IgE.) Go by the slides.</w:t>
             </w:r>
           </w:p>
         </w:tc>

</xml_diff>